<commit_message>
feat: aplica regras de negócio do CRM ēloSites
- Revisões fixadas em exatamente 2 rodadas em todos os documentos
- Revisão de projeto: suporte a 'Projeto Personalizado' com compatibilidade ao valor legado 'Outro'
- Endereço corrigido para 'Rua Dr. Antonio Luis Zorze' nos templates DOCX
- Editor de parcelas responsivo (blocos empilhados com data, valor, status e remoção)
- Financeiro: exibe número, valor, data e status de cada parcela
- Ajustes de responsividade em modais, tabelas e abas; sem overflow horizontal de página
</commit_message>
<xml_diff>
--- a/public/templates/contrato.docx
+++ b/public/templates/contrato.docx
@@ -72,7 +72,7 @@
           <w:sz w:val="22"/>
           <w:szCs w:val="22"/>
         </w:rPr>
-        <w:t xml:space="preserve">Everton Lopes de Oliveira, CPF 298.273.208-40, endereço Rua Dr. Antonio Luiz Zorze, 109, Vila Marlene, Jundiaí/SP, e-mail elosites.br@gmail.com, WhatsApp +55 (11) 99572-2584, doravante denominado(a) CONTRATADO(A).</w:t>
+        <w:t xml:space="preserve">Everton Lopes de Oliveira, CPF 298.273.208-40, endereço Rua Dr. Antonio Luis Zorze, 109, Vila Marlene, Jundiaí/SP, e-mail elosites.br@gmail.com, WhatsApp +55 (11) 99572-2584, doravante denominado(a) CONTRATADO(A).</w:t>
       </w:r>
     </w:p>
     <w:p>
@@ -161,7 +161,7 @@
           <w:sz w:val="22"/>
           <w:szCs w:val="22"/>
         </w:rPr>
-        <w:t xml:space="preserve">[{landingMark}] Landing page   [{siteMark}] Site institucional   [ ] Outro: {otherType}</w:t>
+        <w:t xml:space="preserve">[{landingMark}] Landing page   [{siteMark}] Site institucional   [{otherMark}] Projeto Personalizado</w:t>
       </w:r>
     </w:p>
     <w:p>

</xml_diff>

<commit_message>
feat(crm): escopo automatico e regras de dominio/hospedagem nos documentos
- Novo cliente pre-seleciona o catalogo do tipo de projeto; cliente existente mantem o escopo salvo
- Projeto Personalizado sem itens automaticos
- Catalogos sem publicacao no Netlify, com publicacao neutra e configuracao de dominio/hospedagem de terceiros
- Contrato, Orcamento, Termo de Transferencia, Manutencao e Manual: dominio e hospedagem como servicos de terceiros contratados e pagos pelo cliente
- Contrato recebe o parcelamento real via merge field condicional
</commit_message>
<xml_diff>
--- a/public/templates/contrato.docx
+++ b/public/templates/contrato.docx
@@ -282,7 +282,25 @@
           <w:sz w:val="22"/>
           <w:szCs w:val="22"/>
         </w:rPr>
-        <w:t xml:space="preserve">Publicação do site na URL padrão de hospedagem da ēloSites (Netlify);</w:t>
+        <w:t xml:space="preserve">Publicação e implantação do site no endereço de publicação definido com o(a) CONTRATANTE;</w:t>
+      </w:r>
+    </w:p>
+    <w:p>
+      <w:pPr>
+        <w:pStyle w:val="ListParagraph"/>
+        <w:numPr>
+          <w:ilvl w:val="0"/>
+          <w:numId w:val="1"/>
+        </w:numPr>
+        <w:spacing w:after="80"/>
+      </w:pPr>
+      <w:r>
+        <w:rPr>
+          <w:rFonts w:ascii="Calibri" w:cs="Calibri" w:eastAsia="Calibri" w:hAnsi="Calibri"/>
+          <w:sz w:val="22"/>
+          <w:szCs w:val="22"/>
+        </w:rPr>
+        <w:t xml:space="preserve">Configuração e conexão técnica de domínio e hospedagem contratados diretamente pelo(a) CONTRATANTE junto a provedores de sua escolha, quando previstos no escopo aprovado, sem cobrança adicional específica por essa configuração;</w:t>
       </w:r>
     </w:p>
     <w:p>
@@ -406,25 +424,25 @@
           <w:sz w:val="22"/>
           <w:szCs w:val="22"/>
         </w:rPr>
-        <w:t xml:space="preserve">Registro, renovação ou custo de domínio próprio;</w:t>
-      </w:r>
-    </w:p>
-    <w:p>
-      <w:pPr>
-        <w:pStyle w:val="ListParagraph"/>
-        <w:numPr>
-          <w:ilvl w:val="0"/>
-          <w:numId w:val="1"/>
-        </w:numPr>
-        <w:spacing w:after="80"/>
-      </w:pPr>
-      <w:r>
-        <w:rPr>
-          <w:rFonts w:ascii="Calibri" w:cs="Calibri" w:eastAsia="Calibri" w:hAnsi="Calibri"/>
-          <w:sz w:val="22"/>
-          <w:szCs w:val="22"/>
-        </w:rPr>
-        <w:t xml:space="preserve">Configuração ou migração para outro provedor de hospedagem;</w:t>
+        <w:t xml:space="preserve">Registro, renovação e demais custos de domínio, contratados e pagos diretamente pelo(a) CONTRATANTE junto ao provedor de sua escolha;</w:t>
+      </w:r>
+    </w:p>
+    <w:p>
+      <w:pPr>
+        <w:pStyle w:val="ListParagraph"/>
+        <w:numPr>
+          <w:ilvl w:val="0"/>
+          <w:numId w:val="1"/>
+        </w:numPr>
+        <w:spacing w:after="80"/>
+      </w:pPr>
+      <w:r>
+        <w:rPr>
+          <w:rFonts w:ascii="Calibri" w:cs="Calibri" w:eastAsia="Calibri" w:hAnsi="Calibri"/>
+          <w:sz w:val="22"/>
+          <w:szCs w:val="22"/>
+        </w:rPr>
+        <w:t xml:space="preserve">Migração ou configuração de domínio e hospedagem fora do escopo aprovado, que poderá ser objeto de orçamento separado;</w:t>
       </w:r>
     </w:p>
     <w:p>
@@ -552,6 +570,19 @@
           <w:szCs w:val="22"/>
         </w:rPr>
         <w:t xml:space="preserve">50% (cinquenta por cento) do valor total na entrega final do site, antes da publicação definitiva ou da transferência de acesso ao(à) CONTRATANTE.</w:t>
+      </w:r>
+    </w:p>
+    <w:p>
+      <w:pPr>
+        <w:spacing w:after="100"/>
+      </w:pPr>
+      <w:r>
+        <w:rPr>
+          <w:rFonts w:ascii="Calibri" w:cs="Calibri" w:eastAsia="Calibri" w:hAnsi="Calibri"/>
+          <w:sz w:val="22"/>
+          <w:szCs w:val="22"/>
+        </w:rPr>
+        <w:t xml:space="preserve">{#hasInstallments}Caso o orçamento aprovado preveja parcelamento diferente, aplicam-se as condições nele registradas (Anexo I): {installmentsList}.{/hasInstallments}</w:t>
       </w:r>
     </w:p>
     <w:p>
@@ -741,7 +772,7 @@
           <w:sz w:val="22"/>
           <w:szCs w:val="22"/>
         </w:rPr>
-        <w:t xml:space="preserve">Quando contratada, a manutenção mensal cobre até 5 (cinco) solicitações simples por mês, tais como alterações de texto, imagens, contatos, links e pequenos ajustes visuais. As solicitações não utilizadas não acumulam para o mês seguinte. Não estão cobertas pela manutenção: criação de novas páginas ou funcionalidades, integrações, redesigns, alterações estruturais, domínio e hospedagem em outro provedor — itens que poderão ser orçados separadamente.</w:t>
+        <w:t xml:space="preserve">Quando contratada, a manutenção mensal cobre até 5 (cinco) solicitações simples por mês, tais como alterações de texto, imagens, contatos, links e pequenos ajustes visuais. As solicitações não utilizadas não acumulam para o mês seguinte. Não estão cobertas pela manutenção: criação de novas páginas ou funcionalidades, integrações, redesigns e alterações estruturais, que poderão ser orçadas separadamente. Domínio e hospedagem são serviços de terceiros, contratados e pagos diretamente pelo(a) CONTRATANTE junto aos provedores de sua escolha, não sendo comercializados pela ēloSites.</w:t>
       </w:r>
     </w:p>
     <w:p>
@@ -806,7 +837,7 @@
           <w:sz w:val="22"/>
           <w:szCs w:val="22"/>
         </w:rPr>
-        <w:t xml:space="preserve">A transferência de infraestrutura — repositório no GitHub, conta de hospedagem (Netlify ou outra) e domínio — é tratada separadamente da cessão de direitos sobre o conteúdo, e ocorre apenas quando expressamente solicitada pelo(a) CONTRATANTE, mediante checklist de transferência específico, podendo ser gratuita ou onerosa conforme combinado entre as partes.</w:t>
+        <w:t xml:space="preserve">Domínio e hospedagem são serviços de terceiros, contratados e pagos diretamente pelo(a) CONTRATANTE junto à empresa/provedor de sua preferência. A ēloSites não comercializa, revende ou fornece esses serviços e não recebe comissão por sua contratação. A transferência dos materiais técnicos do projeto — código-fonte, repositório, informações de implantação e configuração efetivamente entregues — é tratada separadamente da cessão de direitos sobre o conteúdo e ocorre apenas quando expressamente solicitada pelo(a) CONTRATANTE, mediante checklist de transferência específico. A configuração e conexão técnica de domínio e hospedagem, quando previstas no escopo aprovado, fazem parte dos entregáveis contratados, sem cobrança adicional específica; migrações ou configurações fora do escopo aprovado poderão ser objeto de orçamento separado.</w:t>
       </w:r>
     </w:p>
     <w:p>

</xml_diff>

<commit_message>
fix: apply contract term/foro/review-round fixes to the actual production templates (public/templates), which the app fetches at runtime; the earlier edits only touched the unused reference copies in templates/. Also removes the now-validated legal disclaimer from the contract per client's lawyer sign-off.
</commit_message>
<xml_diff>
--- a/public/templates/contrato.docx
+++ b/public/templates/contrato.docx
@@ -496,7 +496,7 @@
           <w:sz w:val="22"/>
           <w:szCs w:val="22"/>
         </w:rPr>
-        <w:t xml:space="preserve">Manutenção contínua do site, quando não contratada separadamente (Cláusula 5).</w:t>
+        <w:t xml:space="preserve">Manutenção contínua do site, quando não contratada separadamente (Cláusula 6).</w:t>
       </w:r>
     </w:p>
     <w:p>
@@ -706,7 +706,58 @@
         <w:spacing w:after="150" w:before="300"/>
       </w:pPr>
       <w:r>
-        <w:t xml:space="preserve">5. Manutenção (opcional)</w:t>
+        <w:t xml:space="preserve">5. Vigência do contrato e rescisão antecipada</w:t>
+      </w:r>
+    </w:p>
+    <w:p>
+      <w:pPr>
+        <w:spacing w:after="160"/>
+        <w:jc w:val="both"/>
+      </w:pPr>
+      <w:r>
+        <w:rPr>
+          <w:rFonts w:ascii="Calibri" w:cs="Calibri" w:eastAsia="Calibri" w:hAnsi="Calibri"/>
+          <w:sz w:val="22"/>
+          <w:szCs w:val="22"/>
+        </w:rPr>
+        <w:t xml:space="preserve">Este contrato tem vigência de 24 (vinte e quatro) meses, contados a partir da data de assinatura, podendo ser renovado por igual período mediante acordo entre as partes, manifestado por escrito com antecedência mínima de 30 (trinta) dias do término da vigência.</w:t>
+      </w:r>
+    </w:p>
+    <w:p>
+      <w:pPr>
+        <w:spacing w:after="160"/>
+        <w:jc w:val="both"/>
+      </w:pPr>
+      <w:r>
+        <w:rPr>
+          <w:rFonts w:ascii="Calibri" w:cs="Calibri" w:eastAsia="Calibri" w:hAnsi="Calibri"/>
+          <w:sz w:val="22"/>
+          <w:szCs w:val="22"/>
+        </w:rPr>
+        <w:t xml:space="preserve">Caso o(a) CONTRATANTE opte por encerrar o contrato antes do término da vigência: (i) se o encerramento ocorrer dentro dos primeiros 12 (doze) meses de vigência, será devida ao(à) CONTRATADO(A) multa equivalente a 20% (vinte por cento) do valor total do projeto (Cláusula 3); (ii) se o encerramento ocorrer após os primeiros 12 (doze) meses de vigência, não haverá multa, mediante aviso prévio de 30 (trinta) dias.</w:t>
+      </w:r>
+    </w:p>
+    <w:p>
+      <w:pPr>
+        <w:spacing w:after="160"/>
+        <w:jc w:val="both"/>
+      </w:pPr>
+      <w:r>
+        <w:rPr>
+          <w:rFonts w:ascii="Calibri" w:cs="Calibri" w:eastAsia="Calibri" w:hAnsi="Calibri"/>
+          <w:sz w:val="22"/>
+          <w:szCs w:val="22"/>
+        </w:rPr>
+        <w:t xml:space="preserve">A multa prevista nesta cláusula é independente de eventual encerramento do plano de manutenção mensal (Cláusula 6), que segue suas próprias condições de cancelamento quando contratado separadamente.</w:t>
+      </w:r>
+    </w:p>
+    <w:p>
+      <w:pPr>
+        <w:pStyle w:val="Heading1"/>
+        <w:spacing w:after="150" w:before="300"/>
+      </w:pPr>
+      <w:r>
+        <w:t xml:space="preserve">6. Manutenção (opcional)</w:t>
       </w:r>
     </w:p>
     <w:p>
@@ -795,7 +846,7 @@
         <w:spacing w:after="150" w:before="300"/>
       </w:pPr>
       <w:r>
-        <w:t xml:space="preserve">6. Propriedade, direitos e infraestrutura</w:t>
+        <w:t xml:space="preserve">7. Propriedade, direitos e infraestrutura</w:t>
       </w:r>
     </w:p>
     <w:p>
@@ -860,7 +911,7 @@
         <w:spacing w:after="150" w:before="300"/>
       </w:pPr>
       <w:r>
-        <w:t xml:space="preserve">7. Responsabilidades do(a) CONTRATANTE</w:t>
+        <w:t xml:space="preserve">8. Responsabilidades do(a) CONTRATANTE</w:t>
       </w:r>
     </w:p>
     <w:p>
@@ -941,7 +992,7 @@
         <w:spacing w:after="150" w:before="300"/>
       </w:pPr>
       <w:r>
-        <w:t xml:space="preserve">8. Proteção de dados (LGPD)</w:t>
+        <w:t xml:space="preserve">9. Proteção de dados (LGPD)</w:t>
       </w:r>
     </w:p>
     <w:p>
@@ -964,7 +1015,7 @@
         <w:spacing w:after="150" w:before="300"/>
       </w:pPr>
       <w:r>
-        <w:t xml:space="preserve">9. Rescisão</w:t>
+        <w:t xml:space="preserve">10. Rescisão</w:t>
       </w:r>
     </w:p>
     <w:p>
@@ -1001,7 +1052,7 @@
         <w:spacing w:after="150" w:before="300"/>
       </w:pPr>
       <w:r>
-        <w:t xml:space="preserve">10. Disposições gerais</w:t>
+        <w:t xml:space="preserve">11. Disposições gerais</w:t>
       </w:r>
     </w:p>
     <w:p>
@@ -1016,20 +1067,6 @@
           <w:szCs w:val="22"/>
         </w:rPr>
         <w:t xml:space="preserve">Este contrato representa o entendimento integral entre as partes sobre o objeto aqui tratado, substituindo entendimentos verbais anteriores. Qualquer alteração de escopo, prazo ou valor deverá ser formalizada por escrito (aditivo, e-mail ou mensagem), passando a integrar este contrato.</w:t>
-      </w:r>
-    </w:p>
-    <w:p>
-      <w:pPr>
-        <w:spacing w:after="160"/>
-        <w:jc w:val="both"/>
-      </w:pPr>
-      <w:r>
-        <w:rPr>
-          <w:rFonts w:ascii="Calibri" w:cs="Calibri" w:eastAsia="Calibri" w:hAnsi="Calibri"/>
-          <w:sz w:val="22"/>
-          <w:szCs w:val="22"/>
-        </w:rPr>
-        <w:t xml:space="preserve">Fica eleito o foro da comarca de {jurisdiction} para dirimir eventuais controvérsias decorrentes deste contrato, com renúncia a qualquer outro, por mais privilegiado que seja.</w:t>
       </w:r>
     </w:p>
     <w:p>
@@ -1107,31 +1144,6 @@
     <w:p>
       <w:r>
         <w:br w:type="page"/>
-      </w:r>
-    </w:p>
-    <w:p>
-      <w:pPr>
-        <w:pStyle w:val="Heading1"/>
-        <w:spacing w:after="150" w:before="300"/>
-      </w:pPr>
-      <w:r>
-        <w:t xml:space="preserve">Nota importante — leia antes de usar</w:t>
-      </w:r>
-    </w:p>
-    <w:p>
-      <w:pPr>
-        <w:spacing w:after="200"/>
-      </w:pPr>
-      <w:r>
-        <w:rPr>
-          <w:rFonts w:ascii="Calibri" w:cs="Calibri" w:eastAsia="Calibri" w:hAnsi="Calibri"/>
-          <w:i/>
-          <w:iCs/>
-          <w:color w:val="555555"/>
-          <w:sz w:val="20"/>
-          <w:szCs w:val="20"/>
-        </w:rPr>
-        <w:t xml:space="preserve">Este documento é um modelo técnico de referência, elaborado com base nas práticas comuns de contratos de prestação de serviços de desenvolvimento web e nas informações e preferências fornecidas pela ēloSites. Ele NÃO constitui aconselhamento jurídico. Antes de utilizar este contrato com clientes reais, recomenda-se fortemente a revisão por um(a) advogado(a), que poderá adequá-lo à legislação aplicável ao seu caso específico (incluindo eventual estrutura MEI/ME/Simples Nacional), corrigir eventuais lacunas e validar a cláusula de foro, prazos de rescisão e demais pontos sensíveis.</w:t>
       </w:r>
     </w:p>
     <w:sectPr>

</xml_diff>